<commit_message>
Add text descriptions below each database table in Chapter 4 logical structure design
Co-authored-by: hongwenhao <215252686+hongwenhao@users.noreply.github.com>
</commit_message>
<xml_diff>
--- a/docs/毕业论文第4章_系统设计.docx
+++ b/docs/毕业论文第4章_系统设计.docx
@@ -1496,7 +1496,19 @@
         <w:t>表4-1 用户表结构（users）</w:t>
       </w:r>
     </w:p>
-    <w:p/>
+    <w:p>
+      <w:pPr>
+        <w:ind w:firstLine="480"/>
+      </w:pPr>
+      <w:r>
+        <w:rPr>
+          <w:rFonts w:eastAsia="宋体"/>
+          <w:sz w:val="24"/>
+          <w:szCs w:val="24"/>
+        </w:rPr>
+        <w:t>用户表是系统中最核心的基础表，存储所有注册用户的账户信息和身份数据。该表通过role字段以ENUM类型区分租客（TENANT）、房东（LANDLORD）和管理员（ADMIN）三种角色，不同角色在前端界面和后端权限控制中享有不同的功能入口。username、phone和email三个字段均设置了UNIQUE约束，确保每位用户的登录凭证全局唯一。password字段存储BCrypt算法加密后的哈希值，明文密码不会落库，保障用户信息安全。credit_score字段记录用户信用评分，初始默认值为100分，范围0至200分；该分值将影响合同风险评估等下游业务逻辑。is_real_name_auth字段标识用户是否已完成实名认证，认证通过后可获得额外信用加分。status字段通过ACTIVE和BANNED两个枚举值控制账户的启用或封禁状态，管理员可在后台对违规账号执行封禁操作。</w:t>
+      </w:r>
+    </w:p>
     <w:p>
       <w:pPr>
         <w:pStyle w:val="Heading3"/>
@@ -3572,7 +3584,19 @@
         <w:t>表4-2 房源表结构（houses）</w:t>
       </w:r>
     </w:p>
-    <w:p/>
+    <w:p>
+      <w:pPr>
+        <w:ind w:firstLine="480"/>
+      </w:pPr>
+      <w:r>
+        <w:rPr>
+          <w:rFonts w:eastAsia="宋体"/>
+          <w:sz w:val="24"/>
+          <w:szCs w:val="24"/>
+        </w:rPr>
+        <w:t>房源表是系统中字段最多、业务含义最丰富的数据表，承载了房屋租赁交易的核心标的物信息。该表从多个维度描述一套房源的完整特征：基本信息维度包括标题、描述、城市、区域和详细地址；户型参数维度涵盖面积、室、厅、卫、楼层和装修程度（ROUGH至LUXURY五档）；费用明细维度设置了水、电、燃气、物业和网络五项生活费用，每项费用均配有对应的计费方式字段（fee_type），取值为METERED（按表计费）、FIXED（固定费用）或INCLUDED（包含在租金中），前端会据此动态渲染费用明细卡片，帮助租客在签约前充分了解实际居住成本。owner_type字段是本系统"三类房东透明模型"的关键支撑，通过OWNER（一手房东）、SUBLEASE（二手房东/转租方）和AGENT（持牌中介）三个枚举值在信息层面向租客披露房源的实际出租方身份。status字段管理房源的全生命周期状态，从PENDING（待审核）到APPROVED（审核通过）、ONLINE（已上架）、OFFLINE（已下架）或REJECTED（已驳回），管理员审核通过后房源方可对外展示。images字段以JSON格式存储多张图片URL，tags字段用逗号分隔的标签方便搜索匹配。</w:t>
+      </w:r>
+    </w:p>
     <w:p>
       <w:pPr>
         <w:pStyle w:val="Heading3"/>
@@ -3974,7 +3998,19 @@
         <w:t>表4-3 房源图片表结构（house_images）</w:t>
       </w:r>
     </w:p>
-    <w:p/>
+    <w:p>
+      <w:pPr>
+        <w:ind w:firstLine="480"/>
+      </w:pPr>
+      <w:r>
+        <w:rPr>
+          <w:rFonts w:eastAsia="宋体"/>
+          <w:sz w:val="24"/>
+          <w:szCs w:val="24"/>
+        </w:rPr>
+        <w:t>房源图片表专门管理房源的多媒体图片资源，与房源表构成"一对多"关系——一套房源可关联多张展示图片。image_url字段存储图片的完整访问路径，sort字段为整型排序权重，前端根据该值从小到大展示图片轮播顺序。该表与houses表通过外键house_id建立级联删除（ON DELETE CASCADE）约束，当某套房源记录被删除时，其关联的所有图片记录将自动随之清除，避免产生孤立数据。表结构虽然简洁，但在实际应用中承担着房源详情页图片展示和首页封面图渲染等重要前端功能。</w:t>
+      </w:r>
+    </w:p>
     <w:p>
       <w:pPr>
         <w:pStyle w:val="Heading3"/>
@@ -5024,7 +5060,19 @@
         <w:t>表4-4 订单表结构（orders）</w:t>
       </w:r>
     </w:p>
-    <w:p/>
+    <w:p>
+      <w:pPr>
+        <w:ind w:firstLine="480"/>
+      </w:pPr>
+      <w:r>
+        <w:rPr>
+          <w:rFonts w:eastAsia="宋体"/>
+          <w:sz w:val="24"/>
+          <w:szCs w:val="24"/>
+        </w:rPr>
+        <w:t>订单表记录租客与房东之间的业务交互，是租赁交易流程的数据载体。order_type字段以ENUM类型区分三种订单形态：APPOINTMENT（预约看房）、INTENT（租赁意向）和LEASE（正式租约），覆盖了从初步接触到最终签约的完整业务链路。order_no字段存储系统自动生成的唯一订单编号，便于双方在沟通中引用和后台检索。status字段追踪订单的全生命周期：PENDING（待处理）→ APPROVED（已批准）或REJECTED（已拒绝）→ COMPLETED（已完成）或SIGNED（已签约）或CANCELLED（已取消）。该表同时关联房源ID、租客ID和房东ID三个外键，分别指向houses表和users表，使得系统可以从房源维度、租客维度和房东维度三个方向进行订单查询和统计。appointment_time字段记录预约看房的约定时间，start_date和end_date字段界定租赁期限，monthly_rent和deposit字段存储协商确定的月租金和押金金额，total_amount字段记录合同总价。payment_status字段独立管理支付状态（UNPAID、PAID、REFUNDED），与订单状态解耦，支持灵活的退款流程。</w:t>
+      </w:r>
+    </w:p>
     <w:p>
       <w:pPr>
         <w:pStyle w:val="Heading3"/>
@@ -6398,7 +6446,19 @@
         <w:t>表4-5 合同表结构（contracts）</w:t>
       </w:r>
     </w:p>
-    <w:p/>
+    <w:p>
+      <w:pPr>
+        <w:ind w:firstLine="480"/>
+      </w:pPr>
+      <w:r>
+        <w:rPr>
+          <w:rFonts w:eastAsia="宋体"/>
+          <w:sz w:val="24"/>
+          <w:szCs w:val="24"/>
+        </w:rPr>
+        <w:t>合同表用于管理电子租赁合同的完整生命周期，是本系统实现在线签约功能的核心数据结构。contract_no字段存储系统生成的唯一合同编号，content字段以LONGTEXT类型存储合同正文，支持富文本格式。status字段定义了合同从起草到生效的完整流转路径：DRAFT（草稿）→ PENDING_SIGN（待签署）→ TENANT_SIGNED（租客已签）或 LANDLORD_SIGNED（房东已签）→ FULLY_SIGNED（双方签署完成）或 CANCELLED（已取消）。tenant_signed和landlord_signed两个布尔字段分别标记双方的签署状态，配合tenant_sign_time和landlord_sign_time记录各方签署的精确时间。风控相关字段是本表的一大特色：risk_level字段存储系统对合同条款自动扫描后给出的风险等级（LOW、MEDIUM、HIGH），risk_items字段以JSON格式存储具体的风险条目明细，为签约双方提供智能化的风险预警参考。pdf_path字段记录合同PDF文件的存储路径，支持合同下载和线下留档。该表通过order_id外键与订单表关联，通过house_id、tenant_id和landlord_id分别关联房源和双方用户。</w:t>
+      </w:r>
+    </w:p>
     <w:p>
       <w:pPr>
         <w:pStyle w:val="Heading3"/>
@@ -6962,7 +7022,19 @@
         <w:t>表4-6 站内消息表结构（messages）</w:t>
       </w:r>
     </w:p>
-    <w:p/>
+    <w:p>
+      <w:pPr>
+        <w:ind w:firstLine="480"/>
+      </w:pPr>
+      <w:r>
+        <w:rPr>
+          <w:rFonts w:eastAsia="宋体"/>
+          <w:sz w:val="24"/>
+          <w:szCs w:val="24"/>
+        </w:rPr>
+        <w:t>站内消息表承担系统内部通知和业务事件提醒的职责，确保用户能够及时获知订单状态变更、合同进展和系统公告等重要信息。type字段将消息划分为五种类别：SYSTEM（系统通知）、ORDER（订单相关）、CONTRACT（合同相关）、APPOINTMENT（预约相关）和REVIEW（评价相关），前端根据消息类型渲染不同的图标和跳转链接。is_read字段以TINYINT类型标记消息是否已读，支持前端展示未读消息计数角标；用户可单条标记已读，也可一键将全部消息标记为已读。related_id字段存储触发该消息的业务记录ID（如订单ID或合同ID），用户点击消息后可直接跳转至对应的订单详情或合同详情页面，提升操作效率。该表通过user_id外键关联用户表，并设置级联删除，当用户账号被移除时其历史消息将一并清除。</w:t>
+      </w:r>
+    </w:p>
     <w:p>
       <w:pPr>
         <w:pStyle w:val="Heading3"/>
@@ -7418,7 +7490,19 @@
         <w:t>表4-7 用户行为表结构（user_behaviors）</w:t>
       </w:r>
     </w:p>
-    <w:p/>
+    <w:p>
+      <w:pPr>
+        <w:ind w:firstLine="480"/>
+      </w:pPr>
+      <w:r>
+        <w:rPr>
+          <w:rFonts w:eastAsia="宋体"/>
+          <w:sz w:val="24"/>
+          <w:szCs w:val="24"/>
+        </w:rPr>
+        <w:t>用户行为表是个性化推荐算法的数据基础，记录每位用户对各套房源的交互行为。behavior_type字段以ENUM类型区分四种行为：VIEW（浏览）、COLLECT（收藏）、ORDER（下单）和REVIEW（评价），系统在用户执行对应操作时自动写入行为记录。score字段为不同行为类型分配差异化的权重分值——浏览行为权重1.0、收藏行为权重3.0、下单行为权重5.0，权重的梯度设计反映了用户对房源兴趣程度的递进关系。协同过滤推荐算法基于该表中的数据构建"用户-房源"评分矩阵：首先计算用户之间的行为相似度，然后从相似用户的高分房源中挖掘当前用户尚未接触过的房源作为推荐结果。该表同时建立了user_id和house_id两个索引，保证推荐算法在大数据量下的查询效率。两个外键均配置了级联删除策略，用户或房源被移除时相关行为记录将自动清理。</w:t>
+      </w:r>
+    </w:p>
     <w:p>
       <w:pPr>
         <w:pStyle w:val="Heading3"/>
@@ -7928,7 +8012,19 @@
         <w:t>表4-8 房源评价表结构（reviews）</w:t>
       </w:r>
     </w:p>
-    <w:p/>
+    <w:p>
+      <w:pPr>
+        <w:ind w:firstLine="480"/>
+      </w:pPr>
+      <w:r>
+        <w:rPr>
+          <w:rFonts w:eastAsia="宋体"/>
+          <w:sz w:val="24"/>
+          <w:szCs w:val="24"/>
+        </w:rPr>
+        <w:t>房源评价表记录租客在完成租赁后对所租房源发表的评分和文字点评，是平台口碑体系的数据基础。rating字段采用1至5的整数评分，5分为最高好评，1分为最低差评；前端通过星级图标直观呈现评分结果。content字段以TEXT类型存储评价正文，租客可自由撰写对房源环境、设施和房东服务等方面的体验感受。该表通过house_id和user_id两个外键分别关联房源表和用户表，并可选关联order_id以追溯评价来源于哪笔订单。从房源维度汇总评价可计算平均评分，辅助其他租客在浏览房源详情时作出决策参考；从用户维度查看评价历史，则可用于信用评估和行为分析。两个外键均设置了级联删除，房源或用户被移除时其评价记录将自动清除，保持数据一致性。</w:t>
+      </w:r>
+    </w:p>
     <w:p>
       <w:pPr>
         <w:pStyle w:val="Heading2"/>

</xml_diff>